<commit_message>
Remove pending tasks subheaders from queue views
</commit_message>
<xml_diff>
--- a/CHANGE_REQUEST_LOG.docx
+++ b/CHANGE_REQUEST_LOG.docx
@@ -152,6 +152,11 @@
         <w:t>2026-05-26 13:48:55 - Removed department-required validation for PR create API, made Create disabled until all rows have mandatory specs, and suppressed spec-missing inline row error text.</w:t>
       </w:r>
     </w:p>
+    <w:p>
+      <w:r>
+        <w:t>2026-05-26 15:13:58 - Fixed crash: imported missing MASTERS_TABS in App.tsx (ReferenceError).</w:t>
+      </w:r>
+    </w:p>
     <w:sectPr>
       <w:pgSz w:w="12240" w:h="15840"/>
       <w:pgMar w:top="1440" w:right="1440" w:bottom="1440" w:left="1440" w:header="708" w:footer="708" w:gutter="0"/>

</xml_diff>

<commit_message>
Fix approve PR queue layout and master title import
</commit_message>
<xml_diff>
--- a/CHANGE_REQUEST_LOG.docx
+++ b/CHANGE_REQUEST_LOG.docx
@@ -157,6 +157,16 @@
         <w:t>2026-05-26 15:13:58 - Fixed crash: imported missing MASTERS_TABS in App.tsx (ReferenceError).</w:t>
       </w:r>
     </w:p>
+    <w:p>
+      <w:r>
+        <w:t>2026-05-26 15:19:52 - Removed QueueCard title/subtitle block (e.g., 'Create PO / 2 pending') from all Pending Tasks views.</w:t>
+      </w:r>
+    </w:p>
+    <w:p>
+      <w:r>
+        <w:t>2026-05-26 15:24:28 - Approve PR view: removed Priority from top list table; added Priority in items tables (after Item, before Requested Qty) in expanded row and approve modal; widened approve modal; removed temporary UUID title flash by not showing ID and showing spinner while loading.</w:t>
+      </w:r>
+    </w:p>
     <w:sectPr>
       <w:pgSz w:w="12240" w:h="15840"/>
       <w:pgMar w:top="1440" w:right="1440" w:bottom="1440" w:left="1440" w:header="708" w:footer="708" w:gutter="0"/>

</xml_diff>

<commit_message>
Fix masters header and approve PR view layout
</commit_message>
<xml_diff>
--- a/CHANGE_REQUEST_LOG.docx
+++ b/CHANGE_REQUEST_LOG.docx
@@ -167,6 +167,11 @@
         <w:t>2026-05-26 15:24:28 - Approve PR view: removed Priority from top list table; added Priority in items tables (after Item, before Requested Qty) in expanded row and approve modal; widened approve modal; removed temporary UUID title flash by not showing ID and showing spinner while loading.</w:t>
       </w:r>
     </w:p>
+    <w:p>
+      <w:r>
+        <w:t>2026-05-26 15:28:48 - Fixed Masters header mismatch (title stuck on Customers) by adding mastersTab to App topBar useMemo dependencies.</w:t>
+      </w:r>
+    </w:p>
     <w:sectPr>
       <w:pgSz w:w="12240" w:h="15840"/>
       <w:pgMar w:top="1440" w:right="1440" w:bottom="1440" w:left="1440" w:header="708" w:footer="708" w:gutter="0"/>

</xml_diff>

<commit_message>
PO PDF - Terms & Conditions
</commit_message>
<xml_diff>
--- a/CHANGE_REQUEST_LOG.docx
+++ b/CHANGE_REQUEST_LOG.docx
@@ -182,6 +182,11 @@
         <w:t>2026-05-26 15:46:03 - Check PO / Send PO / Create GRN: removed Priority from main list rows and added Priority inside item-level tables (expanded rows and action modals).</w:t>
       </w:r>
     </w:p>
+    <w:p>
+      <w:r>
+        <w:t>2026-05-26 15:50:59 - PO PDF terms update: now prioritizes Firm Master Terms &amp; Conditions and preserves line-by-line formatting/newlines in the PDF output.</w:t>
+      </w:r>
+    </w:p>
     <w:sectPr>
       <w:pgSz w:w="12240" w:h="15840"/>
       <w:pgMar w:top="1440" w:right="1440" w:bottom="1440" w:left="1440" w:header="708" w:footer="708" w:gutter="0"/>

</xml_diff>